<commit_message>
Aurora Dairies: correct reference timing, sharpen timelines
- Structured screening bullet no longer implies references pre-shortlist;
  reference checks now correctly land in the Interview & Offer Support
  bullet, sequenced post-interview and prior to formal written offer
- Timelines table removes the "Weeks 0–1" prep row (now implicit in
  a lead note) and shifts active search to Weeks 0–3 so the client
  reads an immediate start; final offer/onboarding compresses to
  Weeks 5–6 (was 5–7), reducing total post-acceptance duration from
  7 weeks to 6

Applied to HTML source, deployed slug page, PDF, and Word doc.

Co-Authored-By: Claude Opus 4.7 (1M context) <noreply@anthropic.com>
</commit_message>
<xml_diff>
--- a/proposals/aurora-dairies/Aurora-Dairies-Recruitment-Proposal.docx
+++ b/proposals/aurora-dairies/Aurora-Dairies-Recruitment-Proposal.docx
@@ -772,7 +772,7 @@
           <w:sz w:val="22"/>
           <w:szCs w:val="22"/>
         </w:rPr>
-        <w:t xml:space="preserve">Structured screening — Rigorous conversations and reference validation before any candidate reaches your desk.</w:t>
+        <w:t xml:space="preserve">Structured screening — Rigorous initial conversations and candidate validation before any candidate reaches your desk.</w:t>
       </w:r>
     </w:p>
     <w:p>
@@ -810,7 +810,7 @@
           <w:sz w:val="22"/>
           <w:szCs w:val="22"/>
         </w:rPr>
-        <w:t xml:space="preserve">Interview &amp; offer support — Facilitation through interviews, offer negotiation, references, and onboarding hand-over.</w:t>
+        <w:t xml:space="preserve">Interview &amp; offer support — Facilitation through interviews, post-interview reference checks prior to formal written offer, offer negotiation, and onboarding hand-over.</w:t>
       </w:r>
     </w:p>
     <w:p>
@@ -861,45 +861,26 @@
           <w:sz w:val="22"/>
           <w:szCs w:val="22"/>
         </w:rPr>
-        <w:t xml:space="preserve">Timelines are role-dependent, but as a general guide:</w:t>
-      </w:r>
-    </w:p>
-    <w:p>
-      <w:pPr>
-        <w:pStyle w:val="ListParagraph"/>
-        <w:numPr>
-          <w:ilvl w:val="0"/>
-          <w:numId w:val="2"/>
-        </w:numPr>
-        <w:spacing w:after="60" w:line="280"/>
-      </w:pPr>
-      <w:r>
-        <w:rPr>
-          <w:rFonts w:ascii="Calibri" w:cs="Calibri" w:eastAsia="Calibri" w:hAnsi="Calibri"/>
-          <w:color w:val="14181F"/>
-          <w:sz w:val="22"/>
-          <w:szCs w:val="22"/>
-        </w:rPr>
-        <w:t xml:space="preserve">Weeks 0–1 — Terms accepted, engagement fee received, formal briefs taken</w:t>
-      </w:r>
-    </w:p>
-    <w:p>
-      <w:pPr>
-        <w:pStyle w:val="ListParagraph"/>
-        <w:numPr>
-          <w:ilvl w:val="0"/>
-          <w:numId w:val="2"/>
-        </w:numPr>
-        <w:spacing w:after="60" w:line="280"/>
-      </w:pPr>
-      <w:r>
-        <w:rPr>
-          <w:rFonts w:ascii="Calibri" w:cs="Calibri" w:eastAsia="Calibri" w:hAnsi="Calibri"/>
-          <w:color w:val="14181F"/>
-          <w:sz w:val="22"/>
-          <w:szCs w:val="22"/>
-        </w:rPr>
-        <w:t xml:space="preserve">Weeks 1–3 — Active search and screening</w:t>
+        <w:t xml:space="preserve">Timelines below commence from formal brief and terms acceptance. As a general guide:</w:t>
+      </w:r>
+    </w:p>
+    <w:p>
+      <w:pPr>
+        <w:pStyle w:val="ListParagraph"/>
+        <w:numPr>
+          <w:ilvl w:val="0"/>
+          <w:numId w:val="2"/>
+        </w:numPr>
+        <w:spacing w:after="60" w:line="280"/>
+      </w:pPr>
+      <w:r>
+        <w:rPr>
+          <w:rFonts w:ascii="Calibri" w:cs="Calibri" w:eastAsia="Calibri" w:hAnsi="Calibri"/>
+          <w:color w:val="14181F"/>
+          <w:sz w:val="22"/>
+          <w:szCs w:val="22"/>
+        </w:rPr>
+        <w:t xml:space="preserve">Weeks 0–3 — Active search and screening</w:t>
       </w:r>
     </w:p>
     <w:p>
@@ -937,7 +918,7 @@
           <w:sz w:val="22"/>
           <w:szCs w:val="22"/>
         </w:rPr>
-        <w:t xml:space="preserve">Weeks 5–7 — Offer, acceptance, onboarding support</w:t>
+        <w:t xml:space="preserve">Weeks 5–6 — Post-interview reference checks, offer, acceptance, onboarding support</w:t>
       </w:r>
     </w:p>
     <w:p>

</xml_diff>